<commit_message>
bocetos de la Web
</commit_message>
<xml_diff>
--- a/Documentacion/Prompts investigación perfiles de usuario.docx
+++ b/Documentacion/Prompts investigación perfiles de usuario.docx
@@ -463,7 +463,12 @@
     <w:p>
       <w:pPr>
         <w:pStyle w:val="Heading2"/>
-        <w:bidi w:val="0"/>
+        <w:numPr>
+          <w:ilvl w:val="1"/>
+          <w:numId w:val="1"/>
+        </w:numPr>
+        <w:bidi w:val="0"/>
+        <w:spacing w:before="0" w:after="120"/>
         <w:ind w:hanging="0" w:start="0"/>
         <w:rPr/>
       </w:pPr>
@@ -474,6 +479,41 @@
     </w:p>
     <w:p>
       <w:pPr>
+        <w:pStyle w:val="BodyText"/>
+        <w:bidi w:val="0"/>
+        <w:spacing w:before="0" w:after="120"/>
+        <w:ind w:hanging="0" w:start="0"/>
+        <w:rPr/>
+      </w:pPr>
+      <w:r>
+        <w:rPr/>
+      </w:r>
+    </w:p>
+    <w:p>
+      <w:pPr>
+        <w:pStyle w:val="BodyText"/>
+        <w:bidi w:val="0"/>
+        <w:spacing w:before="0" w:after="120"/>
+        <w:ind w:hanging="0" w:start="0"/>
+        <w:rPr>
+          <w:b/>
+          <w:bCs/>
+          <w:sz w:val="30"/>
+          <w:szCs w:val="30"/>
+        </w:rPr>
+      </w:pPr>
+      <w:r>
+        <w:rPr>
+          <w:b/>
+          <w:bCs/>
+          <w:sz w:val="30"/>
+          <w:szCs w:val="30"/>
+        </w:rPr>
+        <w:t>Prompt 1:</w:t>
+      </w:r>
+    </w:p>
+    <w:p>
+      <w:pPr>
         <w:pStyle w:val="Heading1"/>
         <w:bidi w:val="0"/>
         <w:rPr>
@@ -534,7 +574,43 @@
     </w:p>
     <w:p>
       <w:pPr>
+        <w:pStyle w:val="BodyText"/>
+        <w:bidi w:val="0"/>
+        <w:spacing w:before="0" w:after="120"/>
+        <w:ind w:hanging="0" w:start="0"/>
+        <w:rPr>
+          <w:b/>
+          <w:bCs/>
+          <w:sz w:val="30"/>
+          <w:szCs w:val="30"/>
+        </w:rPr>
+      </w:pPr>
+      <w:r>
+        <w:rPr>
+          <w:b/>
+          <w:bCs/>
+          <w:sz w:val="30"/>
+          <w:szCs w:val="30"/>
+        </w:rPr>
+        <w:t xml:space="preserve">Prompt 2 </w:t>
+      </w:r>
+      <w:r>
+        <w:rPr>
+          <w:b w:val="false"/>
+          <w:bCs w:val="false"/>
+          <w:sz w:val="30"/>
+          <w:szCs w:val="30"/>
+        </w:rPr>
+        <w:t>(Generado con el Prompt 1):</w:t>
+      </w:r>
+    </w:p>
+    <w:p>
+      <w:pPr>
         <w:pStyle w:val="Heading2"/>
+        <w:numPr>
+          <w:ilvl w:val="1"/>
+          <w:numId w:val="1"/>
+        </w:numPr>
         <w:bidi w:val="0"/>
         <w:spacing w:lineRule="auto" w:line="276" w:before="0" w:after="140"/>
         <w:ind w:hanging="0" w:start="0"/>
@@ -719,6 +795,10 @@
     <w:p>
       <w:pPr>
         <w:pStyle w:val="Heading2"/>
+        <w:numPr>
+          <w:ilvl w:val="1"/>
+          <w:numId w:val="1"/>
+        </w:numPr>
         <w:bidi w:val="0"/>
         <w:spacing w:lineRule="auto" w:line="276" w:before="0" w:after="140"/>
         <w:ind w:hanging="0" w:start="0"/>
@@ -988,6 +1068,10 @@
     <w:p>
       <w:pPr>
         <w:pStyle w:val="Heading2"/>
+        <w:numPr>
+          <w:ilvl w:val="1"/>
+          <w:numId w:val="1"/>
+        </w:numPr>
         <w:bidi w:val="0"/>
         <w:spacing w:lineRule="auto" w:line="276" w:before="0" w:after="140"/>
         <w:ind w:hanging="0" w:start="0"/>
@@ -2086,6 +2170,10 @@
     <w:p>
       <w:pPr>
         <w:pStyle w:val="Heading2"/>
+        <w:numPr>
+          <w:ilvl w:val="1"/>
+          <w:numId w:val="1"/>
+        </w:numPr>
         <w:bidi w:val="0"/>
         <w:spacing w:lineRule="auto" w:line="276" w:before="0" w:after="140"/>
         <w:ind w:hanging="0" w:start="0"/>
@@ -3891,6 +3979,10 @@
     <w:p>
       <w:pPr>
         <w:pStyle w:val="Heading2"/>
+        <w:numPr>
+          <w:ilvl w:val="1"/>
+          <w:numId w:val="1"/>
+        </w:numPr>
         <w:bidi w:val="0"/>
         <w:spacing w:lineRule="auto" w:line="276" w:before="0" w:after="140"/>
         <w:ind w:hanging="0" w:start="0"/>
@@ -4151,6 +4243,10 @@
     <w:p>
       <w:pPr>
         <w:pStyle w:val="Heading2"/>
+        <w:numPr>
+          <w:ilvl w:val="1"/>
+          <w:numId w:val="1"/>
+        </w:numPr>
         <w:bidi w:val="0"/>
         <w:spacing w:lineRule="auto" w:line="276" w:before="0" w:after="140"/>
         <w:ind w:hanging="0" w:start="0"/>
@@ -4631,6 +4727,10 @@
     <w:p>
       <w:pPr>
         <w:pStyle w:val="Heading2"/>
+        <w:numPr>
+          <w:ilvl w:val="1"/>
+          <w:numId w:val="1"/>
+        </w:numPr>
         <w:bidi w:val="0"/>
         <w:spacing w:lineRule="auto" w:line="276" w:before="0" w:after="140"/>
         <w:ind w:hanging="0" w:start="0"/>
@@ -4939,6 +5039,10 @@
     <w:p>
       <w:pPr>
         <w:pStyle w:val="Heading2"/>
+        <w:numPr>
+          <w:ilvl w:val="1"/>
+          <w:numId w:val="1"/>
+        </w:numPr>
         <w:bidi w:val="0"/>
         <w:spacing w:lineRule="auto" w:line="276" w:before="0" w:after="140"/>
         <w:ind w:hanging="0" w:start="0"/>
@@ -5022,6 +5126,10 @@
     <w:p>
       <w:pPr>
         <w:pStyle w:val="Heading2"/>
+        <w:numPr>
+          <w:ilvl w:val="1"/>
+          <w:numId w:val="1"/>
+        </w:numPr>
         <w:bidi w:val="0"/>
         <w:spacing w:lineRule="auto" w:line="276" w:before="0" w:after="140"/>
         <w:ind w:hanging="0" w:start="0"/>
@@ -5707,7 +5815,6 @@
     <w:lvl w:ilvl="0">
       <w:start w:val="1"/>
       <w:numFmt w:val="none"/>
-      <w:pStyle w:val="Heading1"/>
       <w:suff w:val="nothing"/>
       <w:lvlText w:val=""/>
       <w:lvlJc w:val="start"/>
@@ -5717,36 +5824,9 @@
         </w:tabs>
         <w:ind w:start="0" w:hanging="0"/>
       </w:pPr>
+      <w:rPr/>
     </w:lvl>
     <w:lvl w:ilvl="1">
-      <w:start w:val="1"/>
-      <w:numFmt w:val="none"/>
-      <w:pStyle w:val="Heading2"/>
-      <w:suff w:val="nothing"/>
-      <w:lvlText w:val=""/>
-      <w:lvlJc w:val="start"/>
-      <w:pPr>
-        <w:tabs>
-          <w:tab w:val="num" w:pos="0"/>
-        </w:tabs>
-        <w:ind w:start="0" w:hanging="0"/>
-      </w:pPr>
-    </w:lvl>
-    <w:lvl w:ilvl="2">
-      <w:start w:val="1"/>
-      <w:numFmt w:val="none"/>
-      <w:pStyle w:val="Heading3"/>
-      <w:suff w:val="nothing"/>
-      <w:lvlText w:val=""/>
-      <w:lvlJc w:val="start"/>
-      <w:pPr>
-        <w:tabs>
-          <w:tab w:val="num" w:pos="0"/>
-        </w:tabs>
-        <w:ind w:start="0" w:hanging="0"/>
-      </w:pPr>
-    </w:lvl>
-    <w:lvl w:ilvl="3">
       <w:start w:val="1"/>
       <w:numFmt w:val="none"/>
       <w:suff w:val="nothing"/>
@@ -5758,8 +5838,9 @@
         </w:tabs>
         <w:ind w:start="0" w:hanging="0"/>
       </w:pPr>
-    </w:lvl>
-    <w:lvl w:ilvl="4">
+      <w:rPr/>
+    </w:lvl>
+    <w:lvl w:ilvl="2">
       <w:start w:val="1"/>
       <w:numFmt w:val="none"/>
       <w:suff w:val="nothing"/>
@@ -5771,8 +5852,9 @@
         </w:tabs>
         <w:ind w:start="0" w:hanging="0"/>
       </w:pPr>
-    </w:lvl>
-    <w:lvl w:ilvl="5">
+      <w:rPr/>
+    </w:lvl>
+    <w:lvl w:ilvl="3">
       <w:start w:val="1"/>
       <w:numFmt w:val="none"/>
       <w:suff w:val="nothing"/>
@@ -5784,8 +5866,9 @@
         </w:tabs>
         <w:ind w:start="0" w:hanging="0"/>
       </w:pPr>
-    </w:lvl>
-    <w:lvl w:ilvl="6">
+      <w:rPr/>
+    </w:lvl>
+    <w:lvl w:ilvl="4">
       <w:start w:val="1"/>
       <w:numFmt w:val="none"/>
       <w:suff w:val="nothing"/>
@@ -5797,8 +5880,9 @@
         </w:tabs>
         <w:ind w:start="0" w:hanging="0"/>
       </w:pPr>
-    </w:lvl>
-    <w:lvl w:ilvl="7">
+      <w:rPr/>
+    </w:lvl>
+    <w:lvl w:ilvl="5">
       <w:start w:val="1"/>
       <w:numFmt w:val="none"/>
       <w:suff w:val="nothing"/>
@@ -5810,8 +5894,9 @@
         </w:tabs>
         <w:ind w:start="0" w:hanging="0"/>
       </w:pPr>
-    </w:lvl>
-    <w:lvl w:ilvl="8">
+      <w:rPr/>
+    </w:lvl>
+    <w:lvl w:ilvl="6">
       <w:start w:val="1"/>
       <w:numFmt w:val="none"/>
       <w:suff w:val="nothing"/>
@@ -5823,6 +5908,35 @@
         </w:tabs>
         <w:ind w:start="0" w:hanging="0"/>
       </w:pPr>
+      <w:rPr/>
+    </w:lvl>
+    <w:lvl w:ilvl="7">
+      <w:start w:val="1"/>
+      <w:numFmt w:val="none"/>
+      <w:suff w:val="nothing"/>
+      <w:lvlText w:val=""/>
+      <w:lvlJc w:val="start"/>
+      <w:pPr>
+        <w:tabs>
+          <w:tab w:val="num" w:pos="0"/>
+        </w:tabs>
+        <w:ind w:start="0" w:hanging="0"/>
+      </w:pPr>
+      <w:rPr/>
+    </w:lvl>
+    <w:lvl w:ilvl="8">
+      <w:start w:val="1"/>
+      <w:numFmt w:val="none"/>
+      <w:suff w:val="nothing"/>
+      <w:lvlText w:val=""/>
+      <w:lvlJc w:val="start"/>
+      <w:pPr>
+        <w:tabs>
+          <w:tab w:val="num" w:pos="0"/>
+        </w:tabs>
+        <w:ind w:start="0" w:hanging="0"/>
+      </w:pPr>
+      <w:rPr/>
     </w:lvl>
   </w:abstractNum>
   <w:abstractNum w:abstractNumId="2">
@@ -9075,6 +9189,125 @@
         <w:ind w:start="6381" w:hanging="283"/>
       </w:pPr>
       <w:rPr/>
+    </w:lvl>
+  </w:abstractNum>
+  <w:abstractNum w:abstractNumId="26">
+    <w:lvl w:ilvl="0">
+      <w:start w:val="1"/>
+      <w:numFmt w:val="none"/>
+      <w:suff w:val="nothing"/>
+      <w:lvlText w:val=""/>
+      <w:lvlJc w:val="start"/>
+      <w:pPr>
+        <w:tabs>
+          <w:tab w:val="num" w:pos="0"/>
+        </w:tabs>
+        <w:ind w:start="0" w:hanging="0"/>
+      </w:pPr>
+    </w:lvl>
+    <w:lvl w:ilvl="1">
+      <w:start w:val="1"/>
+      <w:numFmt w:val="none"/>
+      <w:suff w:val="nothing"/>
+      <w:lvlText w:val=""/>
+      <w:lvlJc w:val="start"/>
+      <w:pPr>
+        <w:tabs>
+          <w:tab w:val="num" w:pos="0"/>
+        </w:tabs>
+        <w:ind w:start="0" w:hanging="0"/>
+      </w:pPr>
+    </w:lvl>
+    <w:lvl w:ilvl="2">
+      <w:start w:val="1"/>
+      <w:numFmt w:val="none"/>
+      <w:suff w:val="nothing"/>
+      <w:lvlText w:val=""/>
+      <w:lvlJc w:val="start"/>
+      <w:pPr>
+        <w:tabs>
+          <w:tab w:val="num" w:pos="0"/>
+        </w:tabs>
+        <w:ind w:start="0" w:hanging="0"/>
+      </w:pPr>
+    </w:lvl>
+    <w:lvl w:ilvl="3">
+      <w:start w:val="1"/>
+      <w:numFmt w:val="none"/>
+      <w:suff w:val="nothing"/>
+      <w:lvlText w:val=""/>
+      <w:lvlJc w:val="start"/>
+      <w:pPr>
+        <w:tabs>
+          <w:tab w:val="num" w:pos="0"/>
+        </w:tabs>
+        <w:ind w:start="0" w:hanging="0"/>
+      </w:pPr>
+    </w:lvl>
+    <w:lvl w:ilvl="4">
+      <w:start w:val="1"/>
+      <w:numFmt w:val="none"/>
+      <w:suff w:val="nothing"/>
+      <w:lvlText w:val=""/>
+      <w:lvlJc w:val="start"/>
+      <w:pPr>
+        <w:tabs>
+          <w:tab w:val="num" w:pos="0"/>
+        </w:tabs>
+        <w:ind w:start="0" w:hanging="0"/>
+      </w:pPr>
+    </w:lvl>
+    <w:lvl w:ilvl="5">
+      <w:start w:val="1"/>
+      <w:numFmt w:val="none"/>
+      <w:suff w:val="nothing"/>
+      <w:lvlText w:val=""/>
+      <w:lvlJc w:val="start"/>
+      <w:pPr>
+        <w:tabs>
+          <w:tab w:val="num" w:pos="0"/>
+        </w:tabs>
+        <w:ind w:start="0" w:hanging="0"/>
+      </w:pPr>
+    </w:lvl>
+    <w:lvl w:ilvl="6">
+      <w:start w:val="1"/>
+      <w:numFmt w:val="none"/>
+      <w:suff w:val="nothing"/>
+      <w:lvlText w:val=""/>
+      <w:lvlJc w:val="start"/>
+      <w:pPr>
+        <w:tabs>
+          <w:tab w:val="num" w:pos="0"/>
+        </w:tabs>
+        <w:ind w:start="0" w:hanging="0"/>
+      </w:pPr>
+    </w:lvl>
+    <w:lvl w:ilvl="7">
+      <w:start w:val="1"/>
+      <w:numFmt w:val="none"/>
+      <w:suff w:val="nothing"/>
+      <w:lvlText w:val=""/>
+      <w:lvlJc w:val="start"/>
+      <w:pPr>
+        <w:tabs>
+          <w:tab w:val="num" w:pos="0"/>
+        </w:tabs>
+        <w:ind w:start="0" w:hanging="0"/>
+      </w:pPr>
+    </w:lvl>
+    <w:lvl w:ilvl="8">
+      <w:start w:val="1"/>
+      <w:numFmt w:val="none"/>
+      <w:suff w:val="nothing"/>
+      <w:lvlText w:val=""/>
+      <w:lvlJc w:val="start"/>
+      <w:pPr>
+        <w:tabs>
+          <w:tab w:val="num" w:pos="0"/>
+        </w:tabs>
+        <w:ind w:start="0" w:hanging="0"/>
+      </w:pPr>
     </w:lvl>
   </w:abstractNum>
   <w:num w:numId="1">
@@ -9152,6 +9385,9 @@
   <w:num w:numId="25">
     <w:abstractNumId w:val="25"/>
   </w:num>
+  <w:num w:numId="26">
+    <w:abstractNumId w:val="26"/>
+  </w:num>
 </w:numbering>
 </file>
 
@@ -9194,8 +9430,9 @@
   </w:style>
   <w:style w:type="paragraph" w:styleId="Heading1">
     <w:name w:val="heading 1"/>
-    <w:basedOn w:val="Ttulo"/>
+    <w:basedOn w:val="Ttulouser"/>
     <w:next w:val="BodyText"/>
+    <w:qFormat/>
     <w:pPr>
       <w:spacing w:before="240" w:after="120"/>
       <w:outlineLvl w:val="0"/>
@@ -9210,8 +9447,9 @@
   </w:style>
   <w:style w:type="paragraph" w:styleId="Heading2">
     <w:name w:val="heading 2"/>
-    <w:basedOn w:val="Ttulo"/>
+    <w:basedOn w:val="Ttulouser"/>
     <w:next w:val="BodyText"/>
+    <w:qFormat/>
     <w:pPr>
       <w:numPr>
         <w:ilvl w:val="1"/>
@@ -9229,8 +9467,9 @@
   </w:style>
   <w:style w:type="paragraph" w:styleId="Heading3">
     <w:name w:val="heading 3"/>
-    <w:basedOn w:val="Ttulo"/>
+    <w:basedOn w:val="Ttulouser"/>
     <w:next w:val="BodyText"/>
+    <w:qFormat/>
     <w:pPr>
       <w:spacing w:before="140" w:after="120"/>
       <w:outlineLvl w:val="2"/>
@@ -9243,8 +9482,8 @@
       <w:szCs w:val="28"/>
     </w:rPr>
   </w:style>
-  <w:style w:type="character" w:styleId="Bolos">
-    <w:name w:val="Bolos"/>
+  <w:style w:type="character" w:styleId="Bolosuser">
+    <w:name w:val="Bolos (user)"/>
     <w:qFormat/>
     <w:rPr>
       <w:rFonts w:ascii="OpenSymbol" w:hAnsi="OpenSymbol" w:eastAsia="OpenSymbol" w:cs="OpenSymbol"/>
@@ -9252,13 +9491,15 @@
   </w:style>
   <w:style w:type="character" w:styleId="Strong">
     <w:name w:val="Strong"/>
+    <w:qFormat/>
     <w:rPr>
       <w:b/>
       <w:bCs/>
     </w:rPr>
   </w:style>
-  <w:style w:type="character" w:styleId="Smbolosdenumeracin">
-    <w:name w:val="Símbolos de numeración"/>
+  <w:style w:type="character" w:styleId="Smbolosdenumeracinuser">
+    <w:name w:val="Símbolos de numeración (user)"/>
+    <w:qFormat/>
     <w:rPr/>
   </w:style>
   <w:style w:type="paragraph" w:styleId="Ttulo">
@@ -9345,9 +9586,10 @@
       <w:rFonts w:cs="Arial"/>
     </w:rPr>
   </w:style>
-  <w:style w:type="paragraph" w:styleId="Cabeceraypie">
-    <w:name w:val="Cabecera y pie"/>
+  <w:style w:type="paragraph" w:styleId="Cabeceraypieuser">
+    <w:name w:val="Cabecera y pie (user)"/>
     <w:basedOn w:val="Normal"/>
+    <w:qFormat/>
     <w:pPr>
       <w:suppressLineNumbers/>
       <w:tabs>
@@ -9358,9 +9600,16 @@
     </w:pPr>
     <w:rPr/>
   </w:style>
+  <w:style w:type="paragraph" w:styleId="Cabeceraypie">
+    <w:name w:val="Cabecera y pie"/>
+    <w:basedOn w:val="Normal"/>
+    <w:qFormat/>
+    <w:pPr/>
+    <w:rPr/>
+  </w:style>
   <w:style w:type="paragraph" w:styleId="Footer">
     <w:name w:val="footer"/>
-    <w:basedOn w:val="Cabeceraypie"/>
+    <w:basedOn w:val="Cabeceraypieuser"/>
     <w:pPr>
       <w:suppressLineNumbers/>
     </w:pPr>

</xml_diff>